<commit_message>
Added Stable Diffusion 3 to compare
</commit_message>
<xml_diff>
--- a/Aug2025/01_Assignments/10_TDM/CAP6411_Assignment_10.docx
+++ b/Aug2025/01_Assignments/10_TDM/CAP6411_Assignment_10.docx
@@ -17,178 +17,281 @@
           <w:sz w:val="18"/>
           <w:szCs w:val="18"/>
         </w:rPr>
-        <w:t xml:space="preserve">Assignment </w:t>
-      </w:r>
-      <w:r>
+        <w:t>Assignment 10: TDM</w:t>
+      </w:r>
+    </w:p>
+    <w:p>
+      <w:pPr>
+        <w:pStyle w:val="Normal"/>
         <w:rPr>
           <w:rFonts w:ascii="Liberation Sans" w:hAnsi="Liberation Sans"/>
           <w:sz w:val="18"/>
           <w:szCs w:val="18"/>
         </w:rPr>
-        <w:t>10</w:t>
-      </w:r>
+      </w:pPr>
       <w:r>
         <w:rPr>
           <w:rFonts w:ascii="Liberation Sans" w:hAnsi="Liberation Sans"/>
           <w:sz w:val="18"/>
           <w:szCs w:val="18"/>
         </w:rPr>
-        <w:t xml:space="preserve">: </w:t>
-      </w:r>
-      <w:r>
+        <w:t>Author: Lam Nguyen</w:t>
+      </w:r>
+    </w:p>
+    <w:p>
+      <w:pPr>
+        <w:pStyle w:val="Normal"/>
         <w:rPr>
           <w:rFonts w:ascii="Liberation Sans" w:hAnsi="Liberation Sans"/>
           <w:sz w:val="18"/>
           <w:szCs w:val="18"/>
         </w:rPr>
-        <w:t>TDM</w:t>
-      </w:r>
-    </w:p>
-    <w:p>
-      <w:pPr>
-        <w:pStyle w:val="Normal"/>
+      </w:pPr>
+      <w:r>
         <w:rPr>
           <w:rFonts w:ascii="Liberation Sans" w:hAnsi="Liberation Sans"/>
           <w:sz w:val="18"/>
           <w:szCs w:val="18"/>
         </w:rPr>
-      </w:pPr>
-      <w:r>
-        <w:rPr>
-          <w:rFonts w:ascii="Liberation Sans" w:hAnsi="Liberation Sans"/>
+        <w:t>Due Date: 13Nov2025</w:t>
+      </w:r>
+    </w:p>
+    <w:p>
+      <w:pPr>
+        <w:pStyle w:val="Normal"/>
+        <w:rPr>
+          <w:rFonts w:ascii="Liberation Sans" w:hAnsi="Liberation Sans"/>
+        </w:rPr>
+      </w:pPr>
+      <w:r>
+        <w:rPr>
+          <w:rFonts w:ascii="Liberation Sans" w:hAnsi="Liberation Sans"/>
+        </w:rPr>
+      </w:r>
+    </w:p>
+    <w:p>
+      <w:pPr>
+        <w:pStyle w:val="Normal"/>
+        <w:jc w:val="center"/>
+        <w:rPr>
+          <w:rFonts w:ascii="Liberation Sans" w:hAnsi="Liberation Sans"/>
+        </w:rPr>
+      </w:pPr>
+      <w:r>
+        <w:rPr>
+          <w:rFonts w:ascii="Liberation Sans" w:hAnsi="Liberation Sans"/>
+          <w:b/>
+          <w:bCs/>
+        </w:rPr>
+        <w:t>Report: Trajectory Distance Matching</w:t>
+      </w:r>
+    </w:p>
+    <w:p>
+      <w:pPr>
+        <w:pStyle w:val="Normal"/>
+        <w:jc w:val="center"/>
+        <w:rPr>
+          <w:rFonts w:ascii="Liberation Sans" w:hAnsi="Liberation Sans"/>
+          <w:b/>
+          <w:b/>
+          <w:bCs/>
+        </w:rPr>
+      </w:pPr>
+      <w:r>
+        <w:rPr>
+          <w:rFonts w:ascii="Liberation Sans" w:hAnsi="Liberation Sans"/>
+          <w:b/>
+          <w:bCs/>
+        </w:rPr>
+      </w:r>
+    </w:p>
+    <w:p>
+      <w:pPr>
+        <w:pStyle w:val="Normal"/>
+        <w:rPr>
+          <w:rFonts w:ascii="Liberation Sans" w:hAnsi="Liberation Sans"/>
+          <w:b/>
+          <w:b/>
+          <w:bCs/>
+        </w:rPr>
+      </w:pPr>
+      <w:r>
+        <w:rPr>
+          <w:rFonts w:ascii="Liberation Sans" w:hAnsi="Liberation Sans"/>
+          <w:b/>
+          <w:bCs/>
+        </w:rPr>
+        <w:t>Introduction</w:t>
+      </w:r>
+    </w:p>
+    <w:p>
+      <w:pPr>
+        <w:pStyle w:val="Normal"/>
+        <w:rPr>
+          <w:rFonts w:ascii="Liberation Sans" w:hAnsi="Liberation Sans"/>
+          <w:b/>
+          <w:b/>
+          <w:bCs/>
+        </w:rPr>
+      </w:pPr>
+      <w:r>
+        <w:rPr/>
+      </w:r>
+    </w:p>
+    <w:p>
+      <w:pPr>
+        <w:pStyle w:val="Normal"/>
+        <w:rPr>
+          <w:rFonts w:ascii="Liberation Sans" w:hAnsi="Liberation Sans"/>
+          <w:b/>
+          <w:b/>
+          <w:bCs/>
+        </w:rPr>
+      </w:pPr>
+      <w:r>
+        <w:rPr>
+          <w:rFonts w:ascii="Liberation Sans" w:hAnsi="Liberation Sans"/>
+          <w:b/>
+          <w:bCs/>
+        </w:rPr>
+        <w:tab/>
+      </w:r>
+      <w:r>
+        <w:rPr>
+          <w:rFonts w:ascii="Liberation Sans" w:hAnsi="Liberation Sans"/>
+          <w:b w:val="false"/>
+          <w:bCs w:val="false"/>
           <w:sz w:val="18"/>
           <w:szCs w:val="18"/>
         </w:rPr>
-        <w:t>Author: Lam Nguyen</w:t>
-      </w:r>
-    </w:p>
-    <w:p>
-      <w:pPr>
-        <w:pStyle w:val="Normal"/>
-        <w:rPr>
-          <w:rFonts w:ascii="Liberation Sans" w:hAnsi="Liberation Sans"/>
+        <w:t>In this assignment we will be implementing Trajectory Distance Matching (TDM) on an image generation model, specifically Stable Diffusion XL Turbo. We will be running SDXL Base, SDXL Turbo and SDXL Turbo with TDM applied to it. And then we will compare performance using Frechet Inception Distance (FID) scores.</w:t>
+      </w:r>
+    </w:p>
+    <w:p>
+      <w:pPr>
+        <w:pStyle w:val="Normal"/>
+        <w:rPr>
+          <w:rFonts w:ascii="Liberation Sans" w:hAnsi="Liberation Sans"/>
+          <w:b/>
+          <w:b/>
+          <w:bCs/>
+        </w:rPr>
+      </w:pPr>
+      <w:r>
+        <w:rPr>
+          <w:rFonts w:ascii="Liberation Sans" w:hAnsi="Liberation Sans"/>
+          <w:b w:val="false"/>
+          <w:bCs w:val="false"/>
           <w:sz w:val="18"/>
           <w:szCs w:val="18"/>
         </w:rPr>
-      </w:pPr>
-      <w:r>
-        <w:rPr>
-          <w:rFonts w:ascii="Liberation Sans" w:hAnsi="Liberation Sans"/>
+        <w:tab/>
+      </w:r>
+    </w:p>
+    <w:p>
+      <w:pPr>
+        <w:pStyle w:val="Normal"/>
+        <w:rPr>
+          <w:rFonts w:ascii="Liberation Sans" w:hAnsi="Liberation Sans"/>
+          <w:b/>
+          <w:b/>
+          <w:bCs/>
+        </w:rPr>
+      </w:pPr>
+      <w:r>
+        <w:rPr>
+          <w:rFonts w:ascii="Liberation Sans" w:hAnsi="Liberation Sans"/>
+          <w:b w:val="false"/>
+          <w:bCs w:val="false"/>
           <w:sz w:val="18"/>
           <w:szCs w:val="18"/>
         </w:rPr>
-        <w:t xml:space="preserve">Due Date: </w:t>
-      </w:r>
-      <w:r>
-        <w:rPr>
-          <w:rFonts w:ascii="Liberation Sans" w:hAnsi="Liberation Sans"/>
+        <w:tab/>
+        <w:t>What is Trajectory Distance Matching (TDM)? TDM is a method of accelerating diffusion model sampling without signficantly affecting image or video generation quality. TDM is a unified distillation paradigm that combines the strengths of distribution and trajectory matching.</w:t>
+      </w:r>
+    </w:p>
+    <w:p>
+      <w:pPr>
+        <w:pStyle w:val="Normal"/>
+        <w:rPr>
+          <w:rFonts w:ascii="Liberation Sans" w:hAnsi="Liberation Sans"/>
+          <w:b/>
+          <w:b/>
+          <w:bCs/>
+        </w:rPr>
+      </w:pPr>
+      <w:r>
+        <w:rPr>
+          <w:rFonts w:ascii="Liberation Sans" w:hAnsi="Liberation Sans"/>
+          <w:b/>
+          <w:bCs/>
+        </w:rPr>
+        <w:tab/>
+      </w:r>
+    </w:p>
+    <w:p>
+      <w:pPr>
+        <w:pStyle w:val="Normal"/>
+        <w:rPr>
+          <w:rFonts w:ascii="Liberation Sans" w:hAnsi="Liberation Sans"/>
+          <w:b/>
+          <w:b/>
+          <w:bCs/>
+        </w:rPr>
+      </w:pPr>
+      <w:r>
+        <w:rPr>
+          <w:rFonts w:ascii="Liberation Sans" w:hAnsi="Liberation Sans"/>
+          <w:b/>
+          <w:bCs/>
+        </w:rPr>
+        <w:tab/>
+      </w:r>
+      <w:r>
+        <w:rPr>
+          <w:rFonts w:ascii="Liberation Sans" w:hAnsi="Liberation Sans"/>
+          <w:b w:val="false"/>
+          <w:bCs w:val="false"/>
           <w:sz w:val="18"/>
           <w:szCs w:val="18"/>
         </w:rPr>
-        <w:t>13</w:t>
-      </w:r>
-      <w:r>
-        <w:rPr>
-          <w:rFonts w:ascii="Liberation Sans" w:hAnsi="Liberation Sans"/>
+        <w:t xml:space="preserve">Although this assignment originally was to apply TDM to the SDXL Turbo model, pre-trained weights did not exist for implementing a LoRA layer over SDXL Turbo model. In order to train the LoRA layer, a lot of time and computing resources would be required. However, weights for TDM implemented with Stable Diffusion 3 do exist. </w:t>
+      </w:r>
+    </w:p>
+    <w:p>
+      <w:pPr>
+        <w:pStyle w:val="Normal"/>
+        <w:rPr>
+          <w:rFonts w:ascii="Liberation Sans" w:hAnsi="Liberation Sans"/>
+          <w:b/>
+          <w:b/>
+          <w:bCs/>
+        </w:rPr>
+      </w:pPr>
+      <w:r>
+        <w:rPr/>
+      </w:r>
+    </w:p>
+    <w:p>
+      <w:pPr>
+        <w:pStyle w:val="Normal"/>
+        <w:rPr>
+          <w:rFonts w:ascii="Liberation Sans" w:hAnsi="Liberation Sans"/>
+          <w:b/>
+          <w:b/>
+          <w:bCs/>
+        </w:rPr>
+      </w:pPr>
+      <w:r>
+        <w:rPr>
+          <w:rFonts w:ascii="Liberation Sans" w:hAnsi="Liberation Sans"/>
+          <w:b w:val="false"/>
+          <w:bCs w:val="false"/>
           <w:sz w:val="18"/>
           <w:szCs w:val="18"/>
         </w:rPr>
-        <w:t>Nov2025</w:t>
-      </w:r>
-    </w:p>
-    <w:p>
-      <w:pPr>
-        <w:pStyle w:val="Normal"/>
-        <w:rPr>
-          <w:rFonts w:ascii="Liberation Sans" w:hAnsi="Liberation Sans"/>
-        </w:rPr>
-      </w:pPr>
-      <w:r>
-        <w:rPr>
-          <w:rFonts w:ascii="Liberation Sans" w:hAnsi="Liberation Sans"/>
-        </w:rPr>
-      </w:r>
-    </w:p>
-    <w:p>
-      <w:pPr>
-        <w:pStyle w:val="Normal"/>
-        <w:jc w:val="center"/>
-        <w:rPr>
-          <w:rFonts w:ascii="Liberation Sans" w:hAnsi="Liberation Sans"/>
-        </w:rPr>
-      </w:pPr>
-      <w:r>
-        <w:rPr>
-          <w:rFonts w:ascii="Liberation Sans" w:hAnsi="Liberation Sans"/>
-          <w:b/>
-          <w:bCs/>
-        </w:rPr>
-        <w:t xml:space="preserve">Report: </w:t>
-      </w:r>
-      <w:r>
-        <w:rPr>
-          <w:rFonts w:ascii="Liberation Sans" w:hAnsi="Liberation Sans"/>
-          <w:b/>
-          <w:bCs/>
-        </w:rPr>
-        <w:t>Trajectory Distance Matching</w:t>
-      </w:r>
-    </w:p>
-    <w:p>
-      <w:pPr>
-        <w:pStyle w:val="Normal"/>
-        <w:jc w:val="center"/>
-        <w:rPr>
-          <w:rFonts w:ascii="Liberation Sans" w:hAnsi="Liberation Sans"/>
-          <w:b/>
-          <w:b/>
-          <w:bCs/>
-        </w:rPr>
-      </w:pPr>
-      <w:r>
-        <w:rPr>
-          <w:rFonts w:ascii="Liberation Sans" w:hAnsi="Liberation Sans"/>
-          <w:b/>
-          <w:bCs/>
-        </w:rPr>
-      </w:r>
-    </w:p>
-    <w:p>
-      <w:pPr>
-        <w:pStyle w:val="Normal"/>
-        <w:rPr>
-          <w:rFonts w:ascii="Liberation Sans" w:hAnsi="Liberation Sans"/>
-          <w:b/>
-          <w:b/>
-          <w:bCs/>
-        </w:rPr>
-      </w:pPr>
-      <w:r>
-        <w:rPr>
-          <w:rFonts w:ascii="Liberation Sans" w:hAnsi="Liberation Sans"/>
-          <w:b/>
-          <w:bCs/>
-        </w:rPr>
-        <w:t>Introduction</w:t>
-      </w:r>
-    </w:p>
-    <w:p>
-      <w:pPr>
-        <w:pStyle w:val="Normal"/>
-        <w:rPr>
-          <w:rFonts w:ascii="Liberation Sans" w:hAnsi="Liberation Sans"/>
-          <w:b/>
-          <w:b/>
-          <w:bCs/>
-        </w:rPr>
-      </w:pPr>
-      <w:r>
-        <w:rPr>
-          <w:rFonts w:ascii="Liberation Sans" w:hAnsi="Liberation Sans"/>
-          <w:b/>
-          <w:bCs/>
-        </w:rPr>
         <w:tab/>
+        <w:t>So in order to compare expected performance increases from implemementing TDM, SD3 will be used on a set of predetermined prompts and SD3 with TDM will then be used on the same prompts and performance will be measured using FID scores.</w:t>
       </w:r>
     </w:p>
     <w:p>
@@ -199,34 +302,6 @@
       <w:r>
         <w:rPr/>
         <w:tab/>
-      </w:r>
-    </w:p>
-    <w:p>
-      <w:pPr>
-        <w:pStyle w:val="Normal"/>
-        <w:rPr/>
-      </w:pPr>
-      <w:r>
-        <w:rPr/>
-        <w:tab/>
-      </w:r>
-    </w:p>
-    <w:p>
-      <w:pPr>
-        <w:pStyle w:val="Normal"/>
-        <w:rPr>
-          <w:rFonts w:ascii="Liberation Sans" w:hAnsi="Liberation Sans"/>
-          <w:b/>
-          <w:b/>
-          <w:bCs/>
-        </w:rPr>
-      </w:pPr>
-      <w:r>
-        <w:rPr>
-          <w:rFonts w:ascii="Liberation Sans" w:hAnsi="Liberation Sans"/>
-          <w:b/>
-          <w:bCs/>
-        </w:rPr>
       </w:r>
     </w:p>
     <w:p>
@@ -299,7 +374,14 @@
         </w:rPr>
       </w:pPr>
       <w:r>
-        <w:rPr/>
+        <w:rPr>
+          <w:rFonts w:eastAsia="Times New Roman" w:cs="Menlo" w:ascii="Liberation Sans" w:hAnsi="Liberation Sans"/>
+          <w:b/>
+          <w:bCs/>
+          <w:color w:val="000000" w:themeColor="text1"/>
+          <w:kern w:val="0"/>
+          <w14:ligatures w14:val="none"/>
+        </w:rPr>
       </w:r>
     </w:p>
     <w:p>

</xml_diff>